<commit_message>
Fixed room scenario following the naming update
</commit_message>
<xml_diff>
--- a/scenarios/station-1-scenario.docx
+++ b/scenarios/station-1-scenario.docx
@@ -1,6 +1,6 @@
 
 <file path=word/document.xml><?xml version="1.0" encoding="utf-8"?>
-<w:document xmlns:wpc="http://schemas.microsoft.com/office/word/2010/wordprocessingCanvas" xmlns:cx="http://schemas.microsoft.com/office/drawing/2014/chartex" xmlns:cx1="http://schemas.microsoft.com/office/drawing/2015/9/8/chartex" xmlns:cx2="http://schemas.microsoft.com/office/drawing/2015/10/21/chartex" xmlns:cx3="http://schemas.microsoft.com/office/drawing/2016/5/9/chartex" xmlns:cx4="http://schemas.microsoft.com/office/drawing/2016/5/10/chartex" xmlns:cx5="http://schemas.microsoft.com/office/drawing/2016/5/11/chartex" xmlns:cx6="http://schemas.microsoft.com/office/drawing/2016/5/12/chartex" xmlns:cx7="http://schemas.microsoft.com/office/drawing/2016/5/13/chartex" xmlns:cx8="http://schemas.microsoft.com/office/drawing/2016/5/14/chartex" xmlns:mc="http://schemas.openxmlformats.org/markup-compatibility/2006" xmlns:aink="http://schemas.microsoft.com/office/drawing/2016/ink" xmlns:am3d="http://schemas.microsoft.com/office/drawing/2017/model3d" xmlns:o="urn:schemas-microsoft-com:office:office" xmlns:oel="http://schemas.microsoft.com/office/2019/extlst" xmlns:r="http://schemas.openxmlformats.org/officeDocument/2006/relationships" xmlns:m="http://schemas.openxmlformats.org/officeDocument/2006/math" xmlns:v="urn:schemas-microsoft-com:vml" xmlns:wp14="http://schemas.microsoft.com/office/word/2010/wordprocessingDrawing" xmlns:wp="http://schemas.openxmlformats.org/drawingml/2006/wordprocessingDrawing" xmlns:w10="urn:schemas-microsoft-com:office:word" xmlns:w="http://schemas.openxmlformats.org/wordprocessingml/2006/main" xmlns:w14="http://schemas.microsoft.com/office/word/2010/wordml" xmlns:w15="http://schemas.microsoft.com/office/word/2012/wordml" xmlns:w16cex="http://schemas.microsoft.com/office/word/2018/wordml/cex" xmlns:w16cid="http://schemas.microsoft.com/office/word/2016/wordml/cid" xmlns:w16="http://schemas.microsoft.com/office/word/2018/wordml" xmlns:w16du="http://schemas.microsoft.com/office/word/2023/wordml/word16du" xmlns:w16sdtdh="http://schemas.microsoft.com/office/word/2020/wordml/sdtdatahash" xmlns:w16sdtfl="http://schemas.microsoft.com/office/word/2024/wordml/sdtformatlock" xmlns:w16se="http://schemas.microsoft.com/office/word/2015/wordml/symex" xmlns:wpg="http://schemas.microsoft.com/office/word/2010/wordprocessingGroup" xmlns:wpi="http://schemas.microsoft.com/office/word/2010/wordprocessingInk" xmlns:wne="http://schemas.microsoft.com/office/word/2006/wordml" xmlns:wps="http://schemas.microsoft.com/office/word/2010/wordprocessingShape" mc:Ignorable="w14 w15 w16se w16cid w16 w16cex w16sdtdh w16sdtfl w16du wp14">
+<w:document xmlns:wpc="http://schemas.microsoft.com/office/word/2010/wordprocessingCanvas" xmlns:cx="http://schemas.microsoft.com/office/drawing/2014/chartex" xmlns:cx1="http://schemas.microsoft.com/office/drawing/2015/9/8/chartex" xmlns:cx2="http://schemas.microsoft.com/office/drawing/2015/10/21/chartex" xmlns:cx3="http://schemas.microsoft.com/office/drawing/2016/5/9/chartex" xmlns:cx4="http://schemas.microsoft.com/office/drawing/2016/5/10/chartex" xmlns:cx5="http://schemas.microsoft.com/office/drawing/2016/5/11/chartex" xmlns:cx6="http://schemas.microsoft.com/office/drawing/2016/5/12/chartex" xmlns:cx7="http://schemas.microsoft.com/office/drawing/2016/5/13/chartex" xmlns:cx8="http://schemas.microsoft.com/office/drawing/2016/5/14/chartex" xmlns:mc="http://schemas.openxmlformats.org/markup-compatibility/2006" xmlns:m="http://schemas.openxmlformats.org/officeDocument/2006/math" xmlns:aink="http://schemas.microsoft.com/office/drawing/2016/ink" xmlns:am3d="http://schemas.microsoft.com/office/drawing/2017/model3d" xmlns:oel="http://schemas.microsoft.com/office/2019/extlst" xmlns:r="http://schemas.openxmlformats.org/officeDocument/2006/relationships" xmlns:wp14="http://schemas.microsoft.com/office/word/2010/wordprocessingDrawing" xmlns:wp="http://schemas.openxmlformats.org/drawingml/2006/wordprocessingDrawing" xmlns:wpg="http://schemas.microsoft.com/office/word/2010/wordprocessingGroup" xmlns:wpi="http://schemas.microsoft.com/office/word/2010/wordprocessingInk" xmlns:wps="http://schemas.microsoft.com/office/word/2010/wordprocessingShape" xmlns:o="urn:schemas-microsoft-com:office:office" xmlns:v="urn:schemas-microsoft-com:vml" xmlns:w10="urn:schemas-microsoft-com:office:word" xmlns:w="http://schemas.openxmlformats.org/wordprocessingml/2006/main" xmlns:w14="http://schemas.microsoft.com/office/word/2010/wordml" xmlns:w15="http://schemas.microsoft.com/office/word/2012/wordml" xmlns:w16cex="http://schemas.microsoft.com/office/word/2018/wordml/cex" xmlns:w16cid="http://schemas.microsoft.com/office/word/2016/wordml/cid" xmlns:w16="http://schemas.microsoft.com/office/word/2018/wordml" xmlns:w16sdtdh="http://schemas.microsoft.com/office/word/2020/wordml/sdtdatahash" xmlns:w16sdtfl="http://schemas.microsoft.com/office/word/2024/wordml/sdtformatlock" xmlns:w16se="http://schemas.microsoft.com/office/word/2015/wordml/symex" xmlns:w16du="http://schemas.microsoft.com/office/word/2023/wordml/word16du" xmlns:wne="http://schemas.microsoft.com/office/word/2006/wordml" mc:Ignorable="w14 w15 w16se w16cid w16 w16cex w16sdtdh w16sdtfl w16du wp14">
   <w:body>
     <w:p>
       <w:pPr>
@@ -914,8 +914,12 @@
       </w:pPr>
     </w:p>
     <w:sectPr>
-      <w:headerReference w:type="default" r:id="rId12"/>
-      <w:footerReference w:type="default" r:id="rId13"/>
+      <w:headerReference w:type="even" r:id="rId12"/>
+      <w:headerReference w:type="default" r:id="rId13"/>
+      <w:footerReference w:type="even" r:id="rId14"/>
+      <w:footerReference w:type="default" r:id="rId15"/>
+      <w:headerReference w:type="first" r:id="rId16"/>
+      <w:footerReference w:type="first" r:id="rId17"/>
       <w:pgSz w:w="11906" w:h="16838"/>
       <w:pgMar w:top="720" w:right="720" w:bottom="720" w:left="720" w:header="708" w:footer="708" w:gutter="0"/>
       <w:cols w:space="708"/>
@@ -926,7 +930,7 @@
 </file>
 
 <file path=word/endnotes.xml><?xml version="1.0" encoding="utf-8"?>
-<w:endnotes xmlns:wpc="http://schemas.microsoft.com/office/word/2010/wordprocessingCanvas" xmlns:cx="http://schemas.microsoft.com/office/drawing/2014/chartex" xmlns:cx1="http://schemas.microsoft.com/office/drawing/2015/9/8/chartex" xmlns:cx2="http://schemas.microsoft.com/office/drawing/2015/10/21/chartex" xmlns:cx3="http://schemas.microsoft.com/office/drawing/2016/5/9/chartex" xmlns:cx4="http://schemas.microsoft.com/office/drawing/2016/5/10/chartex" xmlns:cx5="http://schemas.microsoft.com/office/drawing/2016/5/11/chartex" xmlns:cx6="http://schemas.microsoft.com/office/drawing/2016/5/12/chartex" xmlns:cx7="http://schemas.microsoft.com/office/drawing/2016/5/13/chartex" xmlns:cx8="http://schemas.microsoft.com/office/drawing/2016/5/14/chartex" xmlns:mc="http://schemas.openxmlformats.org/markup-compatibility/2006" xmlns:aink="http://schemas.microsoft.com/office/drawing/2016/ink" xmlns:am3d="http://schemas.microsoft.com/office/drawing/2017/model3d" xmlns:o="urn:schemas-microsoft-com:office:office" xmlns:oel="http://schemas.microsoft.com/office/2019/extlst" xmlns:r="http://schemas.openxmlformats.org/officeDocument/2006/relationships" xmlns:m="http://schemas.openxmlformats.org/officeDocument/2006/math" xmlns:v="urn:schemas-microsoft-com:vml" xmlns:wp14="http://schemas.microsoft.com/office/word/2010/wordprocessingDrawing" xmlns:wp="http://schemas.openxmlformats.org/drawingml/2006/wordprocessingDrawing" xmlns:w10="urn:schemas-microsoft-com:office:word" xmlns:w="http://schemas.openxmlformats.org/wordprocessingml/2006/main" xmlns:w14="http://schemas.microsoft.com/office/word/2010/wordml" xmlns:w15="http://schemas.microsoft.com/office/word/2012/wordml" xmlns:w16cex="http://schemas.microsoft.com/office/word/2018/wordml/cex" xmlns:w16cid="http://schemas.microsoft.com/office/word/2016/wordml/cid" xmlns:w16="http://schemas.microsoft.com/office/word/2018/wordml" xmlns:w16du="http://schemas.microsoft.com/office/word/2023/wordml/word16du" xmlns:w16sdtdh="http://schemas.microsoft.com/office/word/2020/wordml/sdtdatahash" xmlns:w16sdtfl="http://schemas.microsoft.com/office/word/2024/wordml/sdtformatlock" xmlns:w16se="http://schemas.microsoft.com/office/word/2015/wordml/symex" xmlns:wpg="http://schemas.microsoft.com/office/word/2010/wordprocessingGroup" xmlns:wpi="http://schemas.microsoft.com/office/word/2010/wordprocessingInk" xmlns:wne="http://schemas.microsoft.com/office/word/2006/wordml" xmlns:wps="http://schemas.microsoft.com/office/word/2010/wordprocessingShape" mc:Ignorable="w14 w15 w16se w16cid w16 w16cex w16sdtdh w16sdtfl w16du wp14">
+<w:endnotes xmlns:wpc="http://schemas.microsoft.com/office/word/2010/wordprocessingCanvas" xmlns:cx="http://schemas.microsoft.com/office/drawing/2014/chartex" xmlns:cx1="http://schemas.microsoft.com/office/drawing/2015/9/8/chartex" xmlns:cx2="http://schemas.microsoft.com/office/drawing/2015/10/21/chartex" xmlns:cx3="http://schemas.microsoft.com/office/drawing/2016/5/9/chartex" xmlns:cx4="http://schemas.microsoft.com/office/drawing/2016/5/10/chartex" xmlns:cx5="http://schemas.microsoft.com/office/drawing/2016/5/11/chartex" xmlns:cx6="http://schemas.microsoft.com/office/drawing/2016/5/12/chartex" xmlns:cx7="http://schemas.microsoft.com/office/drawing/2016/5/13/chartex" xmlns:cx8="http://schemas.microsoft.com/office/drawing/2016/5/14/chartex" xmlns:mc="http://schemas.openxmlformats.org/markup-compatibility/2006" xmlns:m="http://schemas.openxmlformats.org/officeDocument/2006/math" xmlns:aink="http://schemas.microsoft.com/office/drawing/2016/ink" xmlns:am3d="http://schemas.microsoft.com/office/drawing/2017/model3d" xmlns:oel="http://schemas.microsoft.com/office/2019/extlst" xmlns:r="http://schemas.openxmlformats.org/officeDocument/2006/relationships" xmlns:wp14="http://schemas.microsoft.com/office/word/2010/wordprocessingDrawing" xmlns:wp="http://schemas.openxmlformats.org/drawingml/2006/wordprocessingDrawing" xmlns:wpg="http://schemas.microsoft.com/office/word/2010/wordprocessingGroup" xmlns:wpi="http://schemas.microsoft.com/office/word/2010/wordprocessingInk" xmlns:wps="http://schemas.microsoft.com/office/word/2010/wordprocessingShape" xmlns:o="urn:schemas-microsoft-com:office:office" xmlns:v="urn:schemas-microsoft-com:vml" xmlns:w10="urn:schemas-microsoft-com:office:word" xmlns:w="http://schemas.openxmlformats.org/wordprocessingml/2006/main" xmlns:w14="http://schemas.microsoft.com/office/word/2010/wordml" xmlns:w15="http://schemas.microsoft.com/office/word/2012/wordml" xmlns:w16cex="http://schemas.microsoft.com/office/word/2018/wordml/cex" xmlns:w16cid="http://schemas.microsoft.com/office/word/2016/wordml/cid" xmlns:w16="http://schemas.microsoft.com/office/word/2018/wordml" xmlns:w16sdtdh="http://schemas.microsoft.com/office/word/2020/wordml/sdtdatahash" xmlns:w16sdtfl="http://schemas.microsoft.com/office/word/2024/wordml/sdtformatlock" xmlns:w16se="http://schemas.microsoft.com/office/word/2015/wordml/symex" xmlns:w16du="http://schemas.microsoft.com/office/word/2023/wordml/word16du" xmlns:wne="http://schemas.microsoft.com/office/word/2006/wordml" mc:Ignorable="w14 w15 w16se w16cid w16 w16cex w16sdtdh w16sdtfl w16du wp14">
   <w:endnote w:type="separator" w:id="-1">
     <w:p>
       <w:pPr>
@@ -951,7 +955,17 @@
 </file>
 
 <file path=word/footer1.xml><?xml version="1.0" encoding="utf-8"?>
-<w:ftr xmlns:wpc="http://schemas.microsoft.com/office/word/2010/wordprocessingCanvas" xmlns:cx="http://schemas.microsoft.com/office/drawing/2014/chartex" xmlns:cx1="http://schemas.microsoft.com/office/drawing/2015/9/8/chartex" xmlns:cx2="http://schemas.microsoft.com/office/drawing/2015/10/21/chartex" xmlns:cx3="http://schemas.microsoft.com/office/drawing/2016/5/9/chartex" xmlns:cx4="http://schemas.microsoft.com/office/drawing/2016/5/10/chartex" xmlns:cx5="http://schemas.microsoft.com/office/drawing/2016/5/11/chartex" xmlns:cx6="http://schemas.microsoft.com/office/drawing/2016/5/12/chartex" xmlns:cx7="http://schemas.microsoft.com/office/drawing/2016/5/13/chartex" xmlns:cx8="http://schemas.microsoft.com/office/drawing/2016/5/14/chartex" xmlns:mc="http://schemas.openxmlformats.org/markup-compatibility/2006" xmlns:aink="http://schemas.microsoft.com/office/drawing/2016/ink" xmlns:am3d="http://schemas.microsoft.com/office/drawing/2017/model3d" xmlns:o="urn:schemas-microsoft-com:office:office" xmlns:oel="http://schemas.microsoft.com/office/2019/extlst" xmlns:r="http://schemas.openxmlformats.org/officeDocument/2006/relationships" xmlns:m="http://schemas.openxmlformats.org/officeDocument/2006/math" xmlns:v="urn:schemas-microsoft-com:vml" xmlns:wp14="http://schemas.microsoft.com/office/word/2010/wordprocessingDrawing" xmlns:wp="http://schemas.openxmlformats.org/drawingml/2006/wordprocessingDrawing" xmlns:w10="urn:schemas-microsoft-com:office:word" xmlns:w="http://schemas.openxmlformats.org/wordprocessingml/2006/main" xmlns:w14="http://schemas.microsoft.com/office/word/2010/wordml" xmlns:w15="http://schemas.microsoft.com/office/word/2012/wordml" xmlns:w16cex="http://schemas.microsoft.com/office/word/2018/wordml/cex" xmlns:w16cid="http://schemas.microsoft.com/office/word/2016/wordml/cid" xmlns:w16="http://schemas.microsoft.com/office/word/2018/wordml" xmlns:w16du="http://schemas.microsoft.com/office/word/2023/wordml/word16du" xmlns:w16sdtdh="http://schemas.microsoft.com/office/word/2020/wordml/sdtdatahash" xmlns:w16sdtfl="http://schemas.microsoft.com/office/word/2024/wordml/sdtformatlock" xmlns:w16se="http://schemas.microsoft.com/office/word/2015/wordml/symex" xmlns:wpg="http://schemas.microsoft.com/office/word/2010/wordprocessingGroup" xmlns:wpi="http://schemas.microsoft.com/office/word/2010/wordprocessingInk" xmlns:wne="http://schemas.microsoft.com/office/word/2006/wordml" xmlns:wps="http://schemas.microsoft.com/office/word/2010/wordprocessingShape" mc:Ignorable="w14 w15 w16se w16cid w16 w16cex w16sdtdh w16sdtfl w16du wp14">
+<w:ftr xmlns:wpc="http://schemas.microsoft.com/office/word/2010/wordprocessingCanvas" xmlns:cx="http://schemas.microsoft.com/office/drawing/2014/chartex" xmlns:cx1="http://schemas.microsoft.com/office/drawing/2015/9/8/chartex" xmlns:cx2="http://schemas.microsoft.com/office/drawing/2015/10/21/chartex" xmlns:cx3="http://schemas.microsoft.com/office/drawing/2016/5/9/chartex" xmlns:cx4="http://schemas.microsoft.com/office/drawing/2016/5/10/chartex" xmlns:cx5="http://schemas.microsoft.com/office/drawing/2016/5/11/chartex" xmlns:cx6="http://schemas.microsoft.com/office/drawing/2016/5/12/chartex" xmlns:cx7="http://schemas.microsoft.com/office/drawing/2016/5/13/chartex" xmlns:cx8="http://schemas.microsoft.com/office/drawing/2016/5/14/chartex" xmlns:mc="http://schemas.openxmlformats.org/markup-compatibility/2006" xmlns:m="http://schemas.openxmlformats.org/officeDocument/2006/math" xmlns:aink="http://schemas.microsoft.com/office/drawing/2016/ink" xmlns:am3d="http://schemas.microsoft.com/office/drawing/2017/model3d" xmlns:oel="http://schemas.microsoft.com/office/2019/extlst" xmlns:r="http://schemas.openxmlformats.org/officeDocument/2006/relationships" xmlns:wp14="http://schemas.microsoft.com/office/word/2010/wordprocessingDrawing" xmlns:wp="http://schemas.openxmlformats.org/drawingml/2006/wordprocessingDrawing" xmlns:wpg="http://schemas.microsoft.com/office/word/2010/wordprocessingGroup" xmlns:wpi="http://schemas.microsoft.com/office/word/2010/wordprocessingInk" xmlns:wps="http://schemas.microsoft.com/office/word/2010/wordprocessingShape" xmlns:o="urn:schemas-microsoft-com:office:office" xmlns:v="urn:schemas-microsoft-com:vml" xmlns:w10="urn:schemas-microsoft-com:office:word" xmlns:w="http://schemas.openxmlformats.org/wordprocessingml/2006/main" xmlns:w14="http://schemas.microsoft.com/office/word/2010/wordml" xmlns:w15="http://schemas.microsoft.com/office/word/2012/wordml" xmlns:w16cex="http://schemas.microsoft.com/office/word/2018/wordml/cex" xmlns:w16cid="http://schemas.microsoft.com/office/word/2016/wordml/cid" xmlns:w16="http://schemas.microsoft.com/office/word/2018/wordml" xmlns:w16sdtdh="http://schemas.microsoft.com/office/word/2020/wordml/sdtdatahash" xmlns:w16sdtfl="http://schemas.microsoft.com/office/word/2024/wordml/sdtformatlock" xmlns:w16se="http://schemas.microsoft.com/office/word/2015/wordml/symex" xmlns:w16du="http://schemas.microsoft.com/office/word/2023/wordml/word16du" xmlns:wne="http://schemas.microsoft.com/office/word/2006/wordml" mc:Ignorable="w14 w15 w16se w16cid w16 w16cex w16sdtdh w16sdtfl w16du wp14">
+  <w:p>
+    <w:pPr>
+      <w:pStyle w:val="Footer"/>
+    </w:pPr>
+  </w:p>
+</w:ftr>
+</file>
+
+<file path=word/footer2.xml><?xml version="1.0" encoding="utf-8"?>
+<w:ftr xmlns:wpc="http://schemas.microsoft.com/office/word/2010/wordprocessingCanvas" xmlns:cx="http://schemas.microsoft.com/office/drawing/2014/chartex" xmlns:cx1="http://schemas.microsoft.com/office/drawing/2015/9/8/chartex" xmlns:cx2="http://schemas.microsoft.com/office/drawing/2015/10/21/chartex" xmlns:cx3="http://schemas.microsoft.com/office/drawing/2016/5/9/chartex" xmlns:cx4="http://schemas.microsoft.com/office/drawing/2016/5/10/chartex" xmlns:cx5="http://schemas.microsoft.com/office/drawing/2016/5/11/chartex" xmlns:cx6="http://schemas.microsoft.com/office/drawing/2016/5/12/chartex" xmlns:cx7="http://schemas.microsoft.com/office/drawing/2016/5/13/chartex" xmlns:cx8="http://schemas.microsoft.com/office/drawing/2016/5/14/chartex" xmlns:mc="http://schemas.openxmlformats.org/markup-compatibility/2006" xmlns:m="http://schemas.openxmlformats.org/officeDocument/2006/math" xmlns:aink="http://schemas.microsoft.com/office/drawing/2016/ink" xmlns:am3d="http://schemas.microsoft.com/office/drawing/2017/model3d" xmlns:oel="http://schemas.microsoft.com/office/2019/extlst" xmlns:r="http://schemas.openxmlformats.org/officeDocument/2006/relationships" xmlns:wp14="http://schemas.microsoft.com/office/word/2010/wordprocessingDrawing" xmlns:wp="http://schemas.openxmlformats.org/drawingml/2006/wordprocessingDrawing" xmlns:wpg="http://schemas.microsoft.com/office/word/2010/wordprocessingGroup" xmlns:wpi="http://schemas.microsoft.com/office/word/2010/wordprocessingInk" xmlns:wps="http://schemas.microsoft.com/office/word/2010/wordprocessingShape" xmlns:o="urn:schemas-microsoft-com:office:office" xmlns:v="urn:schemas-microsoft-com:vml" xmlns:w10="urn:schemas-microsoft-com:office:word" xmlns:w="http://schemas.openxmlformats.org/wordprocessingml/2006/main" xmlns:w14="http://schemas.microsoft.com/office/word/2010/wordml" xmlns:w15="http://schemas.microsoft.com/office/word/2012/wordml" xmlns:w16cex="http://schemas.microsoft.com/office/word/2018/wordml/cex" xmlns:w16cid="http://schemas.microsoft.com/office/word/2016/wordml/cid" xmlns:w16="http://schemas.microsoft.com/office/word/2018/wordml" xmlns:w16sdtdh="http://schemas.microsoft.com/office/word/2020/wordml/sdtdatahash" xmlns:w16sdtfl="http://schemas.microsoft.com/office/word/2024/wordml/sdtformatlock" xmlns:w16se="http://schemas.microsoft.com/office/word/2015/wordml/symex" xmlns:w16du="http://schemas.microsoft.com/office/word/2023/wordml/word16du" xmlns:wne="http://schemas.microsoft.com/office/word/2006/wordml" mc:Ignorable="w14 w15 w16se w16cid w16 w16cex w16sdtdh w16sdtfl w16du wp14">
   <w:p>
     <w:pPr>
       <w:pStyle w:val="Footer"/>
@@ -968,8 +982,18 @@
 </w:ftr>
 </file>
 
+<file path=word/footer3.xml><?xml version="1.0" encoding="utf-8"?>
+<w:ftr xmlns:wpc="http://schemas.microsoft.com/office/word/2010/wordprocessingCanvas" xmlns:cx="http://schemas.microsoft.com/office/drawing/2014/chartex" xmlns:cx1="http://schemas.microsoft.com/office/drawing/2015/9/8/chartex" xmlns:cx2="http://schemas.microsoft.com/office/drawing/2015/10/21/chartex" xmlns:cx3="http://schemas.microsoft.com/office/drawing/2016/5/9/chartex" xmlns:cx4="http://schemas.microsoft.com/office/drawing/2016/5/10/chartex" xmlns:cx5="http://schemas.microsoft.com/office/drawing/2016/5/11/chartex" xmlns:cx6="http://schemas.microsoft.com/office/drawing/2016/5/12/chartex" xmlns:cx7="http://schemas.microsoft.com/office/drawing/2016/5/13/chartex" xmlns:cx8="http://schemas.microsoft.com/office/drawing/2016/5/14/chartex" xmlns:mc="http://schemas.openxmlformats.org/markup-compatibility/2006" xmlns:m="http://schemas.openxmlformats.org/officeDocument/2006/math" xmlns:aink="http://schemas.microsoft.com/office/drawing/2016/ink" xmlns:am3d="http://schemas.microsoft.com/office/drawing/2017/model3d" xmlns:oel="http://schemas.microsoft.com/office/2019/extlst" xmlns:r="http://schemas.openxmlformats.org/officeDocument/2006/relationships" xmlns:wp14="http://schemas.microsoft.com/office/word/2010/wordprocessingDrawing" xmlns:wp="http://schemas.openxmlformats.org/drawingml/2006/wordprocessingDrawing" xmlns:wpg="http://schemas.microsoft.com/office/word/2010/wordprocessingGroup" xmlns:wpi="http://schemas.microsoft.com/office/word/2010/wordprocessingInk" xmlns:wps="http://schemas.microsoft.com/office/word/2010/wordprocessingShape" xmlns:o="urn:schemas-microsoft-com:office:office" xmlns:v="urn:schemas-microsoft-com:vml" xmlns:w10="urn:schemas-microsoft-com:office:word" xmlns:w="http://schemas.openxmlformats.org/wordprocessingml/2006/main" xmlns:w14="http://schemas.microsoft.com/office/word/2010/wordml" xmlns:w15="http://schemas.microsoft.com/office/word/2012/wordml" xmlns:w16cex="http://schemas.microsoft.com/office/word/2018/wordml/cex" xmlns:w16cid="http://schemas.microsoft.com/office/word/2016/wordml/cid" xmlns:w16="http://schemas.microsoft.com/office/word/2018/wordml" xmlns:w16sdtdh="http://schemas.microsoft.com/office/word/2020/wordml/sdtdatahash" xmlns:w16sdtfl="http://schemas.microsoft.com/office/word/2024/wordml/sdtformatlock" xmlns:w16se="http://schemas.microsoft.com/office/word/2015/wordml/symex" xmlns:w16du="http://schemas.microsoft.com/office/word/2023/wordml/word16du" xmlns:wne="http://schemas.microsoft.com/office/word/2006/wordml" mc:Ignorable="w14 w15 w16se w16cid w16 w16cex w16sdtdh w16sdtfl w16du wp14">
+  <w:p>
+    <w:pPr>
+      <w:pStyle w:val="Footer"/>
+    </w:pPr>
+  </w:p>
+</w:ftr>
+</file>
+
 <file path=word/footnotes.xml><?xml version="1.0" encoding="utf-8"?>
-<w:footnotes xmlns:wpc="http://schemas.microsoft.com/office/word/2010/wordprocessingCanvas" xmlns:cx="http://schemas.microsoft.com/office/drawing/2014/chartex" xmlns:cx1="http://schemas.microsoft.com/office/drawing/2015/9/8/chartex" xmlns:cx2="http://schemas.microsoft.com/office/drawing/2015/10/21/chartex" xmlns:cx3="http://schemas.microsoft.com/office/drawing/2016/5/9/chartex" xmlns:cx4="http://schemas.microsoft.com/office/drawing/2016/5/10/chartex" xmlns:cx5="http://schemas.microsoft.com/office/drawing/2016/5/11/chartex" xmlns:cx6="http://schemas.microsoft.com/office/drawing/2016/5/12/chartex" xmlns:cx7="http://schemas.microsoft.com/office/drawing/2016/5/13/chartex" xmlns:cx8="http://schemas.microsoft.com/office/drawing/2016/5/14/chartex" xmlns:mc="http://schemas.openxmlformats.org/markup-compatibility/2006" xmlns:aink="http://schemas.microsoft.com/office/drawing/2016/ink" xmlns:am3d="http://schemas.microsoft.com/office/drawing/2017/model3d" xmlns:o="urn:schemas-microsoft-com:office:office" xmlns:oel="http://schemas.microsoft.com/office/2019/extlst" xmlns:r="http://schemas.openxmlformats.org/officeDocument/2006/relationships" xmlns:m="http://schemas.openxmlformats.org/officeDocument/2006/math" xmlns:v="urn:schemas-microsoft-com:vml" xmlns:wp14="http://schemas.microsoft.com/office/word/2010/wordprocessingDrawing" xmlns:wp="http://schemas.openxmlformats.org/drawingml/2006/wordprocessingDrawing" xmlns:w10="urn:schemas-microsoft-com:office:word" xmlns:w="http://schemas.openxmlformats.org/wordprocessingml/2006/main" xmlns:w14="http://schemas.microsoft.com/office/word/2010/wordml" xmlns:w15="http://schemas.microsoft.com/office/word/2012/wordml" xmlns:w16cex="http://schemas.microsoft.com/office/word/2018/wordml/cex" xmlns:w16cid="http://schemas.microsoft.com/office/word/2016/wordml/cid" xmlns:w16="http://schemas.microsoft.com/office/word/2018/wordml" xmlns:w16du="http://schemas.microsoft.com/office/word/2023/wordml/word16du" xmlns:w16sdtdh="http://schemas.microsoft.com/office/word/2020/wordml/sdtdatahash" xmlns:w16sdtfl="http://schemas.microsoft.com/office/word/2024/wordml/sdtformatlock" xmlns:w16se="http://schemas.microsoft.com/office/word/2015/wordml/symex" xmlns:wpg="http://schemas.microsoft.com/office/word/2010/wordprocessingGroup" xmlns:wpi="http://schemas.microsoft.com/office/word/2010/wordprocessingInk" xmlns:wne="http://schemas.microsoft.com/office/word/2006/wordml" xmlns:wps="http://schemas.microsoft.com/office/word/2010/wordprocessingShape" mc:Ignorable="w14 w15 w16se w16cid w16 w16cex w16sdtdh w16sdtfl w16du wp14">
+<w:footnotes xmlns:wpc="http://schemas.microsoft.com/office/word/2010/wordprocessingCanvas" xmlns:cx="http://schemas.microsoft.com/office/drawing/2014/chartex" xmlns:cx1="http://schemas.microsoft.com/office/drawing/2015/9/8/chartex" xmlns:cx2="http://schemas.microsoft.com/office/drawing/2015/10/21/chartex" xmlns:cx3="http://schemas.microsoft.com/office/drawing/2016/5/9/chartex" xmlns:cx4="http://schemas.microsoft.com/office/drawing/2016/5/10/chartex" xmlns:cx5="http://schemas.microsoft.com/office/drawing/2016/5/11/chartex" xmlns:cx6="http://schemas.microsoft.com/office/drawing/2016/5/12/chartex" xmlns:cx7="http://schemas.microsoft.com/office/drawing/2016/5/13/chartex" xmlns:cx8="http://schemas.microsoft.com/office/drawing/2016/5/14/chartex" xmlns:mc="http://schemas.openxmlformats.org/markup-compatibility/2006" xmlns:m="http://schemas.openxmlformats.org/officeDocument/2006/math" xmlns:aink="http://schemas.microsoft.com/office/drawing/2016/ink" xmlns:am3d="http://schemas.microsoft.com/office/drawing/2017/model3d" xmlns:oel="http://schemas.microsoft.com/office/2019/extlst" xmlns:r="http://schemas.openxmlformats.org/officeDocument/2006/relationships" xmlns:wp14="http://schemas.microsoft.com/office/word/2010/wordprocessingDrawing" xmlns:wp="http://schemas.openxmlformats.org/drawingml/2006/wordprocessingDrawing" xmlns:wpg="http://schemas.microsoft.com/office/word/2010/wordprocessingGroup" xmlns:wpi="http://schemas.microsoft.com/office/word/2010/wordprocessingInk" xmlns:wps="http://schemas.microsoft.com/office/word/2010/wordprocessingShape" xmlns:o="urn:schemas-microsoft-com:office:office" xmlns:v="urn:schemas-microsoft-com:vml" xmlns:w10="urn:schemas-microsoft-com:office:word" xmlns:w="http://schemas.openxmlformats.org/wordprocessingml/2006/main" xmlns:w14="http://schemas.microsoft.com/office/word/2010/wordml" xmlns:w15="http://schemas.microsoft.com/office/word/2012/wordml" xmlns:w16cex="http://schemas.microsoft.com/office/word/2018/wordml/cex" xmlns:w16cid="http://schemas.microsoft.com/office/word/2016/wordml/cid" xmlns:w16="http://schemas.microsoft.com/office/word/2018/wordml" xmlns:w16sdtdh="http://schemas.microsoft.com/office/word/2020/wordml/sdtdatahash" xmlns:w16sdtfl="http://schemas.microsoft.com/office/word/2024/wordml/sdtformatlock" xmlns:w16se="http://schemas.microsoft.com/office/word/2015/wordml/symex" xmlns:w16du="http://schemas.microsoft.com/office/word/2023/wordml/word16du" xmlns:wne="http://schemas.microsoft.com/office/word/2006/wordml" mc:Ignorable="w14 w15 w16se w16cid w16 w16cex w16sdtdh w16sdtfl w16du wp14">
   <w:footnote w:type="separator" w:id="-1">
     <w:p>
       <w:pPr>
@@ -994,7 +1018,17 @@
 </file>
 
 <file path=word/header1.xml><?xml version="1.0" encoding="utf-8"?>
-<w:hdr xmlns:wpc="http://schemas.microsoft.com/office/word/2010/wordprocessingCanvas" xmlns:cx="http://schemas.microsoft.com/office/drawing/2014/chartex" xmlns:cx1="http://schemas.microsoft.com/office/drawing/2015/9/8/chartex" xmlns:cx2="http://schemas.microsoft.com/office/drawing/2015/10/21/chartex" xmlns:cx3="http://schemas.microsoft.com/office/drawing/2016/5/9/chartex" xmlns:cx4="http://schemas.microsoft.com/office/drawing/2016/5/10/chartex" xmlns:cx5="http://schemas.microsoft.com/office/drawing/2016/5/11/chartex" xmlns:cx6="http://schemas.microsoft.com/office/drawing/2016/5/12/chartex" xmlns:cx7="http://schemas.microsoft.com/office/drawing/2016/5/13/chartex" xmlns:cx8="http://schemas.microsoft.com/office/drawing/2016/5/14/chartex" xmlns:mc="http://schemas.openxmlformats.org/markup-compatibility/2006" xmlns:aink="http://schemas.microsoft.com/office/drawing/2016/ink" xmlns:am3d="http://schemas.microsoft.com/office/drawing/2017/model3d" xmlns:o="urn:schemas-microsoft-com:office:office" xmlns:oel="http://schemas.microsoft.com/office/2019/extlst" xmlns:r="http://schemas.openxmlformats.org/officeDocument/2006/relationships" xmlns:m="http://schemas.openxmlformats.org/officeDocument/2006/math" xmlns:v="urn:schemas-microsoft-com:vml" xmlns:wp14="http://schemas.microsoft.com/office/word/2010/wordprocessingDrawing" xmlns:wp="http://schemas.openxmlformats.org/drawingml/2006/wordprocessingDrawing" xmlns:w10="urn:schemas-microsoft-com:office:word" xmlns:w="http://schemas.openxmlformats.org/wordprocessingml/2006/main" xmlns:w14="http://schemas.microsoft.com/office/word/2010/wordml" xmlns:w15="http://schemas.microsoft.com/office/word/2012/wordml" xmlns:w16cex="http://schemas.microsoft.com/office/word/2018/wordml/cex" xmlns:w16cid="http://schemas.microsoft.com/office/word/2016/wordml/cid" xmlns:w16="http://schemas.microsoft.com/office/word/2018/wordml" xmlns:w16du="http://schemas.microsoft.com/office/word/2023/wordml/word16du" xmlns:w16sdtdh="http://schemas.microsoft.com/office/word/2020/wordml/sdtdatahash" xmlns:w16sdtfl="http://schemas.microsoft.com/office/word/2024/wordml/sdtformatlock" xmlns:w16se="http://schemas.microsoft.com/office/word/2015/wordml/symex" xmlns:wpg="http://schemas.microsoft.com/office/word/2010/wordprocessingGroup" xmlns:wpi="http://schemas.microsoft.com/office/word/2010/wordprocessingInk" xmlns:wne="http://schemas.microsoft.com/office/word/2006/wordml" xmlns:wps="http://schemas.microsoft.com/office/word/2010/wordprocessingShape" mc:Ignorable="w14 w15 w16se w16cid w16 w16cex w16sdtdh w16sdtfl w16du wp14">
+<w:hdr xmlns:wpc="http://schemas.microsoft.com/office/word/2010/wordprocessingCanvas" xmlns:cx="http://schemas.microsoft.com/office/drawing/2014/chartex" xmlns:cx1="http://schemas.microsoft.com/office/drawing/2015/9/8/chartex" xmlns:cx2="http://schemas.microsoft.com/office/drawing/2015/10/21/chartex" xmlns:cx3="http://schemas.microsoft.com/office/drawing/2016/5/9/chartex" xmlns:cx4="http://schemas.microsoft.com/office/drawing/2016/5/10/chartex" xmlns:cx5="http://schemas.microsoft.com/office/drawing/2016/5/11/chartex" xmlns:cx6="http://schemas.microsoft.com/office/drawing/2016/5/12/chartex" xmlns:cx7="http://schemas.microsoft.com/office/drawing/2016/5/13/chartex" xmlns:cx8="http://schemas.microsoft.com/office/drawing/2016/5/14/chartex" xmlns:mc="http://schemas.openxmlformats.org/markup-compatibility/2006" xmlns:m="http://schemas.openxmlformats.org/officeDocument/2006/math" xmlns:aink="http://schemas.microsoft.com/office/drawing/2016/ink" xmlns:am3d="http://schemas.microsoft.com/office/drawing/2017/model3d" xmlns:oel="http://schemas.microsoft.com/office/2019/extlst" xmlns:r="http://schemas.openxmlformats.org/officeDocument/2006/relationships" xmlns:wp14="http://schemas.microsoft.com/office/word/2010/wordprocessingDrawing" xmlns:wp="http://schemas.openxmlformats.org/drawingml/2006/wordprocessingDrawing" xmlns:wpg="http://schemas.microsoft.com/office/word/2010/wordprocessingGroup" xmlns:wpi="http://schemas.microsoft.com/office/word/2010/wordprocessingInk" xmlns:wps="http://schemas.microsoft.com/office/word/2010/wordprocessingShape" xmlns:o="urn:schemas-microsoft-com:office:office" xmlns:v="urn:schemas-microsoft-com:vml" xmlns:w10="urn:schemas-microsoft-com:office:word" xmlns:w="http://schemas.openxmlformats.org/wordprocessingml/2006/main" xmlns:w14="http://schemas.microsoft.com/office/word/2010/wordml" xmlns:w15="http://schemas.microsoft.com/office/word/2012/wordml" xmlns:w16cex="http://schemas.microsoft.com/office/word/2018/wordml/cex" xmlns:w16cid="http://schemas.microsoft.com/office/word/2016/wordml/cid" xmlns:w16="http://schemas.microsoft.com/office/word/2018/wordml" xmlns:w16sdtdh="http://schemas.microsoft.com/office/word/2020/wordml/sdtdatahash" xmlns:w16sdtfl="http://schemas.microsoft.com/office/word/2024/wordml/sdtformatlock" xmlns:w16se="http://schemas.microsoft.com/office/word/2015/wordml/symex" xmlns:w16du="http://schemas.microsoft.com/office/word/2023/wordml/word16du" xmlns:wne="http://schemas.microsoft.com/office/word/2006/wordml" mc:Ignorable="w14 w15 w16se w16cid w16 w16cex w16sdtdh w16sdtfl w16du wp14">
+  <w:p>
+    <w:pPr>
+      <w:pStyle w:val="Header"/>
+    </w:pPr>
+  </w:p>
+</w:hdr>
+</file>
+
+<file path=word/header2.xml><?xml version="1.0" encoding="utf-8"?>
+<w:hdr xmlns:wpc="http://schemas.microsoft.com/office/word/2010/wordprocessingCanvas" xmlns:cx="http://schemas.microsoft.com/office/drawing/2014/chartex" xmlns:cx1="http://schemas.microsoft.com/office/drawing/2015/9/8/chartex" xmlns:cx2="http://schemas.microsoft.com/office/drawing/2015/10/21/chartex" xmlns:cx3="http://schemas.microsoft.com/office/drawing/2016/5/9/chartex" xmlns:cx4="http://schemas.microsoft.com/office/drawing/2016/5/10/chartex" xmlns:cx5="http://schemas.microsoft.com/office/drawing/2016/5/11/chartex" xmlns:cx6="http://schemas.microsoft.com/office/drawing/2016/5/12/chartex" xmlns:cx7="http://schemas.microsoft.com/office/drawing/2016/5/13/chartex" xmlns:cx8="http://schemas.microsoft.com/office/drawing/2016/5/14/chartex" xmlns:mc="http://schemas.openxmlformats.org/markup-compatibility/2006" xmlns:m="http://schemas.openxmlformats.org/officeDocument/2006/math" xmlns:aink="http://schemas.microsoft.com/office/drawing/2016/ink" xmlns:am3d="http://schemas.microsoft.com/office/drawing/2017/model3d" xmlns:oel="http://schemas.microsoft.com/office/2019/extlst" xmlns:r="http://schemas.openxmlformats.org/officeDocument/2006/relationships" xmlns:wp14="http://schemas.microsoft.com/office/word/2010/wordprocessingDrawing" xmlns:wp="http://schemas.openxmlformats.org/drawingml/2006/wordprocessingDrawing" xmlns:wpg="http://schemas.microsoft.com/office/word/2010/wordprocessingGroup" xmlns:wpi="http://schemas.microsoft.com/office/word/2010/wordprocessingInk" xmlns:wps="http://schemas.microsoft.com/office/word/2010/wordprocessingShape" xmlns:o="urn:schemas-microsoft-com:office:office" xmlns:v="urn:schemas-microsoft-com:vml" xmlns:w10="urn:schemas-microsoft-com:office:word" xmlns:w="http://schemas.openxmlformats.org/wordprocessingml/2006/main" xmlns:w14="http://schemas.microsoft.com/office/word/2010/wordml" xmlns:w15="http://schemas.microsoft.com/office/word/2012/wordml" xmlns:w16cex="http://schemas.microsoft.com/office/word/2018/wordml/cex" xmlns:w16cid="http://schemas.microsoft.com/office/word/2016/wordml/cid" xmlns:w16="http://schemas.microsoft.com/office/word/2018/wordml" xmlns:w16sdtdh="http://schemas.microsoft.com/office/word/2020/wordml/sdtdatahash" xmlns:w16sdtfl="http://schemas.microsoft.com/office/word/2024/wordml/sdtformatlock" xmlns:w16se="http://schemas.microsoft.com/office/word/2015/wordml/symex" xmlns:w16du="http://schemas.microsoft.com/office/word/2023/wordml/word16du" xmlns:wne="http://schemas.microsoft.com/office/word/2006/wordml" mc:Ignorable="w14 w15 w16se w16cid w16 w16cex w16sdtdh w16sdtfl w16du wp14">
   <w:p>
     <w:pPr>
       <w:pStyle w:val="Header"/>
@@ -1102,7 +1136,17 @@
                                   <w:sz w:val="28"/>
                                   <w:szCs w:val="28"/>
                                 </w:rPr>
-                                <w:t>TecHnical Architecture Escape Room</w:t>
+                                <w:t>SYSTEM DESIGN</w:t>
+                              </w:r>
+                              <w:r>
+                                <w:rPr>
+                                  <w:b/>
+                                  <w:caps/>
+                                  <w:spacing w:val="20"/>
+                                  <w:sz w:val="28"/>
+                                  <w:szCs w:val="28"/>
+                                </w:rPr>
+                                <w:t xml:space="preserve"> Escape Room</w:t>
                               </w:r>
                             </w:p>
                           </w:sdtContent>
@@ -1169,7 +1213,17 @@
                             <w:sz w:val="28"/>
                             <w:szCs w:val="28"/>
                           </w:rPr>
-                          <w:t>TecHnical Architecture Escape Room</w:t>
+                          <w:t>SYSTEM DESIGN</w:t>
+                        </w:r>
+                        <w:r>
+                          <w:rPr>
+                            <w:b/>
+                            <w:caps/>
+                            <w:spacing w:val="20"/>
+                            <w:sz w:val="28"/>
+                            <w:szCs w:val="28"/>
+                          </w:rPr>
+                          <w:t xml:space="preserve"> Escape Room</w:t>
                         </w:r>
                       </w:p>
                     </w:sdtContent>
@@ -1191,8 +1245,18 @@
 </w:hdr>
 </file>
 
+<file path=word/header3.xml><?xml version="1.0" encoding="utf-8"?>
+<w:hdr xmlns:wpc="http://schemas.microsoft.com/office/word/2010/wordprocessingCanvas" xmlns:cx="http://schemas.microsoft.com/office/drawing/2014/chartex" xmlns:cx1="http://schemas.microsoft.com/office/drawing/2015/9/8/chartex" xmlns:cx2="http://schemas.microsoft.com/office/drawing/2015/10/21/chartex" xmlns:cx3="http://schemas.microsoft.com/office/drawing/2016/5/9/chartex" xmlns:cx4="http://schemas.microsoft.com/office/drawing/2016/5/10/chartex" xmlns:cx5="http://schemas.microsoft.com/office/drawing/2016/5/11/chartex" xmlns:cx6="http://schemas.microsoft.com/office/drawing/2016/5/12/chartex" xmlns:cx7="http://schemas.microsoft.com/office/drawing/2016/5/13/chartex" xmlns:cx8="http://schemas.microsoft.com/office/drawing/2016/5/14/chartex" xmlns:mc="http://schemas.openxmlformats.org/markup-compatibility/2006" xmlns:m="http://schemas.openxmlformats.org/officeDocument/2006/math" xmlns:aink="http://schemas.microsoft.com/office/drawing/2016/ink" xmlns:am3d="http://schemas.microsoft.com/office/drawing/2017/model3d" xmlns:oel="http://schemas.microsoft.com/office/2019/extlst" xmlns:r="http://schemas.openxmlformats.org/officeDocument/2006/relationships" xmlns:wp14="http://schemas.microsoft.com/office/word/2010/wordprocessingDrawing" xmlns:wp="http://schemas.openxmlformats.org/drawingml/2006/wordprocessingDrawing" xmlns:wpg="http://schemas.microsoft.com/office/word/2010/wordprocessingGroup" xmlns:wpi="http://schemas.microsoft.com/office/word/2010/wordprocessingInk" xmlns:wps="http://schemas.microsoft.com/office/word/2010/wordprocessingShape" xmlns:o="urn:schemas-microsoft-com:office:office" xmlns:v="urn:schemas-microsoft-com:vml" xmlns:w10="urn:schemas-microsoft-com:office:word" xmlns:w="http://schemas.openxmlformats.org/wordprocessingml/2006/main" xmlns:w14="http://schemas.microsoft.com/office/word/2010/wordml" xmlns:w15="http://schemas.microsoft.com/office/word/2012/wordml" xmlns:w16cex="http://schemas.microsoft.com/office/word/2018/wordml/cex" xmlns:w16cid="http://schemas.microsoft.com/office/word/2016/wordml/cid" xmlns:w16="http://schemas.microsoft.com/office/word/2018/wordml" xmlns:w16sdtdh="http://schemas.microsoft.com/office/word/2020/wordml/sdtdatahash" xmlns:w16sdtfl="http://schemas.microsoft.com/office/word/2024/wordml/sdtformatlock" xmlns:w16se="http://schemas.microsoft.com/office/word/2015/wordml/symex" xmlns:w16du="http://schemas.microsoft.com/office/word/2023/wordml/word16du" xmlns:wne="http://schemas.microsoft.com/office/word/2006/wordml" mc:Ignorable="w14 w15 w16se w16cid w16 w16cex w16sdtdh w16sdtfl w16du wp14">
+  <w:p>
+    <w:pPr>
+      <w:pStyle w:val="Header"/>
+    </w:pPr>
+  </w:p>
+</w:hdr>
+</file>
+
 <file path=word/numbering.xml><?xml version="1.0" encoding="utf-8"?>
-<w:numbering xmlns:wpc="http://schemas.microsoft.com/office/word/2010/wordprocessingCanvas" xmlns:cx="http://schemas.microsoft.com/office/drawing/2014/chartex" xmlns:cx1="http://schemas.microsoft.com/office/drawing/2015/9/8/chartex" xmlns:cx2="http://schemas.microsoft.com/office/drawing/2015/10/21/chartex" xmlns:cx3="http://schemas.microsoft.com/office/drawing/2016/5/9/chartex" xmlns:cx4="http://schemas.microsoft.com/office/drawing/2016/5/10/chartex" xmlns:cx5="http://schemas.microsoft.com/office/drawing/2016/5/11/chartex" xmlns:cx6="http://schemas.microsoft.com/office/drawing/2016/5/12/chartex" xmlns:cx7="http://schemas.microsoft.com/office/drawing/2016/5/13/chartex" xmlns:cx8="http://schemas.microsoft.com/office/drawing/2016/5/14/chartex" xmlns:mc="http://schemas.openxmlformats.org/markup-compatibility/2006" xmlns:aink="http://schemas.microsoft.com/office/drawing/2016/ink" xmlns:am3d="http://schemas.microsoft.com/office/drawing/2017/model3d" xmlns:o="urn:schemas-microsoft-com:office:office" xmlns:oel="http://schemas.microsoft.com/office/2019/extlst" xmlns:r="http://schemas.openxmlformats.org/officeDocument/2006/relationships" xmlns:m="http://schemas.openxmlformats.org/officeDocument/2006/math" xmlns:v="urn:schemas-microsoft-com:vml" xmlns:wp14="http://schemas.microsoft.com/office/word/2010/wordprocessingDrawing" xmlns:wp="http://schemas.openxmlformats.org/drawingml/2006/wordprocessingDrawing" xmlns:w10="urn:schemas-microsoft-com:office:word" xmlns:w="http://schemas.openxmlformats.org/wordprocessingml/2006/main" xmlns:w14="http://schemas.microsoft.com/office/word/2010/wordml" xmlns:w15="http://schemas.microsoft.com/office/word/2012/wordml" xmlns:w16cex="http://schemas.microsoft.com/office/word/2018/wordml/cex" xmlns:w16cid="http://schemas.microsoft.com/office/word/2016/wordml/cid" xmlns:w16="http://schemas.microsoft.com/office/word/2018/wordml" xmlns:w16du="http://schemas.microsoft.com/office/word/2023/wordml/word16du" xmlns:w16sdtdh="http://schemas.microsoft.com/office/word/2020/wordml/sdtdatahash" xmlns:w16sdtfl="http://schemas.microsoft.com/office/word/2024/wordml/sdtformatlock" xmlns:w16se="http://schemas.microsoft.com/office/word/2015/wordml/symex" xmlns:wpg="http://schemas.microsoft.com/office/word/2010/wordprocessingGroup" xmlns:wpi="http://schemas.microsoft.com/office/word/2010/wordprocessingInk" xmlns:wne="http://schemas.microsoft.com/office/word/2006/wordml" xmlns:wps="http://schemas.microsoft.com/office/word/2010/wordprocessingShape" mc:Ignorable="w14 w15 w16se w16cid w16 w16cex w16sdtdh w16sdtfl w16du wp14">
+<w:numbering xmlns:wpc="http://schemas.microsoft.com/office/word/2010/wordprocessingCanvas" xmlns:cx="http://schemas.microsoft.com/office/drawing/2014/chartex" xmlns:cx1="http://schemas.microsoft.com/office/drawing/2015/9/8/chartex" xmlns:cx2="http://schemas.microsoft.com/office/drawing/2015/10/21/chartex" xmlns:cx3="http://schemas.microsoft.com/office/drawing/2016/5/9/chartex" xmlns:cx4="http://schemas.microsoft.com/office/drawing/2016/5/10/chartex" xmlns:cx5="http://schemas.microsoft.com/office/drawing/2016/5/11/chartex" xmlns:cx6="http://schemas.microsoft.com/office/drawing/2016/5/12/chartex" xmlns:cx7="http://schemas.microsoft.com/office/drawing/2016/5/13/chartex" xmlns:cx8="http://schemas.microsoft.com/office/drawing/2016/5/14/chartex" xmlns:mc="http://schemas.openxmlformats.org/markup-compatibility/2006" xmlns:m="http://schemas.openxmlformats.org/officeDocument/2006/math" xmlns:aink="http://schemas.microsoft.com/office/drawing/2016/ink" xmlns:am3d="http://schemas.microsoft.com/office/drawing/2017/model3d" xmlns:oel="http://schemas.microsoft.com/office/2019/extlst" xmlns:r="http://schemas.openxmlformats.org/officeDocument/2006/relationships" xmlns:wp14="http://schemas.microsoft.com/office/word/2010/wordprocessingDrawing" xmlns:wp="http://schemas.openxmlformats.org/drawingml/2006/wordprocessingDrawing" xmlns:wpg="http://schemas.microsoft.com/office/word/2010/wordprocessingGroup" xmlns:wpi="http://schemas.microsoft.com/office/word/2010/wordprocessingInk" xmlns:wps="http://schemas.microsoft.com/office/word/2010/wordprocessingShape" xmlns:o="urn:schemas-microsoft-com:office:office" xmlns:v="urn:schemas-microsoft-com:vml" xmlns:w10="urn:schemas-microsoft-com:office:word" xmlns:w="http://schemas.openxmlformats.org/wordprocessingml/2006/main" xmlns:w14="http://schemas.microsoft.com/office/word/2010/wordml" xmlns:w15="http://schemas.microsoft.com/office/word/2012/wordml" xmlns:w16cex="http://schemas.microsoft.com/office/word/2018/wordml/cex" xmlns:w16cid="http://schemas.microsoft.com/office/word/2016/wordml/cid" xmlns:w16="http://schemas.microsoft.com/office/word/2018/wordml" xmlns:w16sdtdh="http://schemas.microsoft.com/office/word/2020/wordml/sdtdatahash" xmlns:w16sdtfl="http://schemas.microsoft.com/office/word/2024/wordml/sdtformatlock" xmlns:w16se="http://schemas.microsoft.com/office/word/2015/wordml/symex" xmlns:w16du="http://schemas.microsoft.com/office/word/2023/wordml/word16du" xmlns:wne="http://schemas.microsoft.com/office/word/2006/wordml" mc:Ignorable="w14 w15 w16se w16cid w16 w16cex w16sdtdh w16sdtfl w16du wp14">
   <w:numPicBullet w:numPicBulletId="0">
     <w:pict>
       <v:shapetype w14:anchorId="5A381C20" id="_x0000_t75" coordsize="21600,21600" o:spt="75" o:preferrelative="t" path="m@4@5l@4@11@9@11@9@5xe" filled="f" stroked="f">
@@ -1214,7 +1278,7 @@
         <v:path o:extrusionok="f" gradientshapeok="t" o:connecttype="rect"/>
         <o:lock v:ext="edit" aspectratio="t"/>
       </v:shapetype>
-      <v:shape id="Graphic 1" o:spid="_x0000_i1025" type="#_x0000_t75" alt="Badge 1 outline" style="width:30.05pt;height:30.05pt;visibility:visible" o:bullet="t">
+      <v:shape id="Graphic 1" o:spid="_x0000_i1025" type="#_x0000_t75" alt="Badge 1 outline" style="width:30pt;height:30pt;visibility:visible" o:bullet="t">
         <v:imagedata r:id="rId1" o:title="" croptop="-4520f" cropbottom="-6328f" cropleft="-4520f" cropright="-6328f"/>
       </v:shape>
     </w:pict>
@@ -1911,7 +1975,7 @@
 </file>
 
 <file path=word/styles.xml><?xml version="1.0" encoding="utf-8"?>
-<w:styles xmlns:mc="http://schemas.openxmlformats.org/markup-compatibility/2006" xmlns:r="http://schemas.openxmlformats.org/officeDocument/2006/relationships" xmlns:w="http://schemas.openxmlformats.org/wordprocessingml/2006/main" xmlns:w14="http://schemas.microsoft.com/office/word/2010/wordml" xmlns:w15="http://schemas.microsoft.com/office/word/2012/wordml" xmlns:w16cex="http://schemas.microsoft.com/office/word/2018/wordml/cex" xmlns:w16cid="http://schemas.microsoft.com/office/word/2016/wordml/cid" xmlns:w16="http://schemas.microsoft.com/office/word/2018/wordml" xmlns:w16du="http://schemas.microsoft.com/office/word/2023/wordml/word16du" xmlns:w16sdtdh="http://schemas.microsoft.com/office/word/2020/wordml/sdtdatahash" xmlns:w16sdtfl="http://schemas.microsoft.com/office/word/2024/wordml/sdtformatlock" xmlns:w16se="http://schemas.microsoft.com/office/word/2015/wordml/symex" mc:Ignorable="w14 w15 w16se w16cid w16 w16cex w16sdtdh w16sdtfl w16du">
+<w:styles xmlns:mc="http://schemas.openxmlformats.org/markup-compatibility/2006" xmlns:r="http://schemas.openxmlformats.org/officeDocument/2006/relationships" xmlns:w="http://schemas.openxmlformats.org/wordprocessingml/2006/main" xmlns:w14="http://schemas.microsoft.com/office/word/2010/wordml" xmlns:w15="http://schemas.microsoft.com/office/word/2012/wordml" xmlns:w16cex="http://schemas.microsoft.com/office/word/2018/wordml/cex" xmlns:w16cid="http://schemas.microsoft.com/office/word/2016/wordml/cid" xmlns:w16="http://schemas.microsoft.com/office/word/2018/wordml" xmlns:w16sdtdh="http://schemas.microsoft.com/office/word/2020/wordml/sdtdatahash" xmlns:w16sdtfl="http://schemas.microsoft.com/office/word/2024/wordml/sdtformatlock" xmlns:w16se="http://schemas.microsoft.com/office/word/2015/wordml/symex" xmlns:w16du="http://schemas.microsoft.com/office/word/2023/wordml/word16du" mc:Ignorable="w14 w15 w16se w16cid w16 w16cex w16sdtdh w16sdtfl w16du">
   <w:docDefaults>
     <w:rPrDefault>
       <w:rPr>

</xml_diff>